<commit_message>
Ajoute la signature Yousign au suivi FOAD APS
</commit_message>
<xml_diff>
--- a/templates_word/tableau_suivi_foad_cnaps.docx
+++ b/templates_word/tableau_suivi_foad_cnaps.docx
@@ -1040,13 +1040,16 @@
           </w:p>
           <w:p>
             <w:pPr>
-              <w:spacing w:after="0" w:line="240" w:lineRule="auto"/>
+              <w:spacing w:after="0" w:line="240" w:lineRule="auto" w:before="60"/>
+              <w:jc w:val="center"/>
             </w:pPr>
             <w:r>
               <w:rPr>
-                <w:sz w:val="16"/>
+                <w:rFonts w:ascii="Segoe UI" w:hAnsi="Segoe UI"/>
+                <w:color w:val="991B1B"/>
+                <w:sz w:val="18"/>
               </w:rPr>
-              <w:t xml:space="preserve"> </w:t>
+              <w:t>{{s1|signature|160|60}}</w:t>
             </w:r>
           </w:p>
           <w:p>
@@ -1197,13 +1200,79 @@
           </w:p>
           <w:p>
             <w:pPr>
-              <w:spacing w:after="0" w:line="240" w:lineRule="auto"/>
+              <w:spacing w:after="0" w:line="240" w:lineRule="auto" w:before="40"/>
+              <w:jc w:val="center"/>
             </w:pPr>
             <w:r>
-              <w:rPr>
-                <w:sz w:val="16"/>
-              </w:rPr>
-              <w:t xml:space="preserve"> </w:t>
+              <w:drawing>
+                <wp:inline xmlns:a="http://schemas.openxmlformats.org/drawingml/2006/main" xmlns:pic="http://schemas.openxmlformats.org/drawingml/2006/picture">
+                  <wp:extent cx="1584000" cy="537006"/>
+                  <wp:docPr id="2" name="Picture 2" descr="Tampon et signature de Clément VAILLANT"/>
+                  <wp:cNvGraphicFramePr>
+                    <a:graphicFrameLocks noChangeAspect="1"/>
+                  </wp:cNvGraphicFramePr>
+                  <a:graphic>
+                    <a:graphicData uri="http://schemas.openxmlformats.org/drawingml/2006/picture">
+                      <pic:pic>
+                        <pic:nvPicPr>
+                          <pic:cNvPr id="0" name="tampon.png"/>
+                          <pic:cNvPicPr/>
+                        </pic:nvPicPr>
+                        <pic:blipFill>
+                          <a:blip r:embed="rId12"/>
+                          <a:stretch>
+                            <a:fillRect/>
+                          </a:stretch>
+                        </pic:blipFill>
+                        <pic:spPr>
+                          <a:xfrm>
+                            <a:off x="0" y="0"/>
+                            <a:ext cx="1584000" cy="537006"/>
+                          </a:xfrm>
+                          <a:prstGeom prst="rect"/>
+                        </pic:spPr>
+                      </pic:pic>
+                    </a:graphicData>
+                  </a:graphic>
+                </wp:inline>
+              </w:drawing>
+            </w:r>
+            <w:r>
+              <w:t xml:space="preserve">  </w:t>
+            </w:r>
+            <w:r>
+              <w:drawing>
+                <wp:inline xmlns:a="http://schemas.openxmlformats.org/drawingml/2006/main" xmlns:pic="http://schemas.openxmlformats.org/drawingml/2006/picture">
+                  <wp:extent cx="972000" cy="542671"/>
+                  <wp:docPr id="3" name="Picture 3" descr="Signature de Clément VAILLANT"/>
+                  <wp:cNvGraphicFramePr>
+                    <a:graphicFrameLocks noChangeAspect="1"/>
+                  </wp:cNvGraphicFramePr>
+                  <a:graphic>
+                    <a:graphicData uri="http://schemas.openxmlformats.org/drawingml/2006/picture">
+                      <pic:pic>
+                        <pic:nvPicPr>
+                          <pic:cNvPr id="0" name="signature-clement-vaillant.png"/>
+                          <pic:cNvPicPr/>
+                        </pic:nvPicPr>
+                        <pic:blipFill>
+                          <a:blip r:embed="rId13"/>
+                          <a:stretch>
+                            <a:fillRect/>
+                          </a:stretch>
+                        </pic:blipFill>
+                        <pic:spPr>
+                          <a:xfrm>
+                            <a:off x="0" y="0"/>
+                            <a:ext cx="972000" cy="542671"/>
+                          </a:xfrm>
+                          <a:prstGeom prst="rect"/>
+                        </pic:spPr>
+                      </pic:pic>
+                    </a:graphicData>
+                  </a:graphic>
+                </wp:inline>
+              </w:drawing>
             </w:r>
           </w:p>
           <w:p>

</xml_diff>

<commit_message>
Ajoute le forçage contrôlé des dossiers FOAD
</commit_message>
<xml_diff>
--- a/templates_word/tableau_suivi_foad_cnaps.docx
+++ b/templates_word/tableau_suivi_foad_cnaps.docx
@@ -1283,17 +1283,17 @@
         <w:tc>
           <w:tcPr>
             <w:tcW w:type="dxa" w:w="10432"/>
-            <w:shd w:fill="F0FDF4"/>
+            <w:shd w:fill="FFF7E6"/>
             <w:tcBorders>
-              <w:top w:val="single" w:sz="10" w:space="0" w:color="166534"/>
-              <w:left w:val="single" w:sz="10" w:space="0" w:color="166534"/>
-              <w:bottom w:val="single" w:sz="10" w:space="0" w:color="166534"/>
-              <w:right w:val="single" w:sz="10" w:space="0" w:color="166534"/>
+              <w:top w:val="single" w:sz="10" w:space="0" w:color="E78B18"/>
+              <w:left w:val="single" w:sz="10" w:space="0" w:color="E78B18"/>
+              <w:bottom w:val="single" w:sz="10" w:space="0" w:color="E78B18"/>
+              <w:right w:val="single" w:sz="10" w:space="0" w:color="E78B18"/>
             </w:tcBorders>
             <w:tcMar>
-              <w:top w:w="80" w:type="dxa"/>
+              <w:top w:w="65" w:type="dxa"/>
               <w:start w:w="110" w:type="dxa"/>
-              <w:bottom w:w="80" w:type="dxa"/>
+              <w:bottom w:w="65" w:type="dxa"/>
               <w:end w:w="110" w:type="dxa"/>
             </w:tcMar>
           </w:tcPr>
@@ -1307,10 +1307,42 @@
                 <w:rFonts w:ascii="DejaVu Sans" w:hAnsi="DejaVu Sans"/>
                 <w:b/>
                 <w:i w:val="0"/>
-                <w:color w:val="166534"/>
-                <w:sz w:val="17"/>
+                <w:color w:val="E78B18"/>
+                <w:sz w:val="16"/>
               </w:rPr>
-              <w:t>CONTRÔLE AUTOMATIQUE : {{ compliance_status }}</w:t>
+              <w:t>DÉCISION DE GÉNÉRATION : {{ compliance_status }}</w:t>
+            </w:r>
+          </w:p>
+          <w:p>
+            <w:pPr>
+              <w:spacing w:before="40" w:after="0" w:line="240" w:lineRule="auto"/>
+              <w:jc w:val="center"/>
+            </w:pPr>
+            <w:r>
+              <w:rPr>
+                <w:rFonts w:ascii="DejaVu Sans" w:hAnsi="DejaVu Sans"/>
+                <w:b w:val="0"/>
+                <w:i w:val="0"/>
+                <w:color w:val="172033"/>
+                <w:sz w:val="14"/>
+              </w:rPr>
+              <w:t>{{ compliance_detail }}</w:t>
+            </w:r>
+          </w:p>
+          <w:p>
+            <w:pPr>
+              <w:spacing w:before="40" w:after="0" w:line="240" w:lineRule="auto"/>
+              <w:jc w:val="center"/>
+            </w:pPr>
+            <w:r>
+              <w:rPr>
+                <w:rFonts w:ascii="DejaVu Sans" w:hAnsi="DejaVu Sans"/>
+                <w:b/>
+                <w:i w:val="0"/>
+                <w:color w:val="991B1B"/>
+                <w:sz w:val="14"/>
+              </w:rPr>
+              <w:t>{{ force_authorization }}</w:t>
             </w:r>
           </w:p>
         </w:tc>
@@ -1926,7 +1958,7 @@
                 <w:color w:val="1D4ED8"/>
                 <w:sz w:val="15"/>
               </w:rPr>
-              <w:t>À SIGNER APRÈS CONTRÔLE — Toute anomalie d'identité, de durée, de connexion, de progression ou d'évaluation doit être corrigée dans Digiforma avant signature.</w:t>
+              <w:t>{{ signature_instruction }}</w:t>
             </w:r>
           </w:p>
         </w:tc>
@@ -2195,7 +2227,7 @@
                 <w:color w:val="172033"/>
                 <w:sz w:val="15"/>
               </w:rPr>
-              <w:t>la validation des questionnaires prévus et le déblocage séquentiel du parcours conformément au dispositif déclaré ;</w:t>
+              <w:t>le paramétrage des questionnaires prévus et le suivi séquentiel du parcours conformément au dispositif déclaré ;</w:t>
             </w:r>
           </w:p>
           <w:p>

</xml_diff>

<commit_message>
Simplifier le tableau de suivi FOAD APS
</commit_message>
<xml_diff>
--- a/templates_word/tableau_suivi_foad_cnaps.docx
+++ b/templates_word/tableau_suivi_foad_cnaps.docx
@@ -131,56 +131,6 @@
       <w:tblPr>
         <w:tblW w:type="auto" w:w="0"/>
         <w:jc w:val="center"/>
-        <w:tblLook w:firstColumn="1" w:firstRow="1" w:lastColumn="0" w:lastRow="0" w:noHBand="0" w:noVBand="1" w:val="04A0"/>
-      </w:tblPr>
-      <w:tblGrid>
-        <w:gridCol w:w="10432"/>
-      </w:tblGrid>
-      <w:tr>
-        <w:tc>
-          <w:tcPr>
-            <w:tcW w:type="dxa" w:w="10432"/>
-            <w:shd w:fill="FFF7E6"/>
-            <w:tcBorders>
-              <w:top w:val="single" w:sz="10" w:space="0" w:color="F5B942"/>
-              <w:left w:val="single" w:sz="10" w:space="0" w:color="F5B942"/>
-              <w:bottom w:val="single" w:sz="10" w:space="0" w:color="F5B942"/>
-              <w:right w:val="single" w:sz="10" w:space="0" w:color="F5B942"/>
-            </w:tcBorders>
-            <w:tcMar>
-              <w:top w:w="90" w:type="dxa"/>
-              <w:start w:w="130" w:type="dxa"/>
-              <w:bottom w:w="90" w:type="dxa"/>
-              <w:end w:w="130" w:type="dxa"/>
-            </w:tcMar>
-          </w:tcPr>
-          <w:p>
-            <w:pPr>
-              <w:spacing w:before="0" w:after="0" w:line="240" w:lineRule="auto"/>
-            </w:pPr>
-            <w:r>
-              <w:rPr>
-                <w:rFonts w:ascii="DejaVu Sans" w:hAnsi="DejaVu Sans"/>
-                <w:b/>
-                <w:i w:val="0"/>
-                <w:color w:val="172033"/>
-                <w:sz w:val="16"/>
-              </w:rPr>
-              <w:t>DOSSIER INDISSOCIABLE — Les 2 pages du présent bordereau et toutes les pages du relevé individuel Digiforma sont assemblées dans un PDF unique soumis à la signature électronique Yousign.</w:t>
-            </w:r>
-          </w:p>
-        </w:tc>
-      </w:tr>
-    </w:tbl>
-    <w:p>
-      <w:pPr>
-        <w:spacing w:before="0" w:after="60" w:line="240" w:lineRule="auto"/>
-      </w:pPr>
-    </w:p>
-    <w:tbl>
-      <w:tblPr>
-        <w:tblW w:type="auto" w:w="0"/>
-        <w:jc w:val="center"/>
         <w:tblLayout w:type="fixed"/>
         <w:tblLook w:firstColumn="1" w:firstRow="1" w:lastColumn="0" w:lastRow="0" w:noHBand="0" w:noVBand="1" w:val="04A0"/>
       </w:tblPr>
@@ -300,7 +250,7 @@
                 <w:color w:val="64748B"/>
                 <w:sz w:val="14"/>
               </w:rPr>
-              <w:t>Formation / session</w:t>
+              <w:t>Formation</w:t>
               <w:br/>
             </w:r>
             <w:r>
@@ -614,7 +564,7 @@
                 <w:color w:val="64748B"/>
                 <w:sz w:val="14"/>
               </w:rPr>
-              <w:t>Lieu d'établissement</w:t>
+              <w:t>Lieu d’établissement</w:t>
               <w:br/>
             </w:r>
             <w:r>
@@ -625,7 +575,281 @@
                 <w:color w:val="172033"/>
                 <w:sz w:val="16"/>
               </w:rPr>
-              <w:t>Puget-sur-Argens</w:t>
+              <w:t>Intégrale Sécurité Formations</w:t>
+              <w:br/>
+              <w:t>54 chemin du Carreou</w:t>
+              <w:br/>
+              <w:t>83480 PUGET SUR ARGENS</w:t>
+            </w:r>
+          </w:p>
+        </w:tc>
+      </w:tr>
+      <w:tr>
+        <w:tc>
+          <w:tcPr>
+            <w:tcW w:type="dxa" w:w="3311999"/>
+            <w:shd w:fill="FFFFFF"/>
+            <w:tcMar>
+              <w:top w:w="65" w:type="dxa"/>
+              <w:start w:w="100" w:type="dxa"/>
+              <w:bottom w:w="65" w:type="dxa"/>
+              <w:end w:w="100" w:type="dxa"/>
+            </w:tcMar>
+            <w:tcBorders>
+              <w:top w:val="single" w:sz="6" w:space="0" w:color="CBD5E1"/>
+              <w:left w:val="single" w:sz="6" w:space="0" w:color="CBD5E1"/>
+              <w:bottom w:val="single" w:sz="6" w:space="0" w:color="CBD5E1"/>
+              <w:right w:val="single" w:sz="6" w:space="0" w:color="CBD5E1"/>
+            </w:tcBorders>
+          </w:tcPr>
+          <w:p>
+            <w:pPr>
+              <w:spacing w:before="0" w:after="0" w:line="240" w:lineRule="auto"/>
+            </w:pPr>
+            <w:r>
+              <w:rPr>
+                <w:rFonts w:ascii="DejaVu Sans" w:hAnsi="DejaVu Sans"/>
+                <w:b/>
+                <w:i w:val="0"/>
+                <w:color w:val="64748B"/>
+                <w:sz w:val="14"/>
+              </w:rPr>
+              <w:t>Organisme de formation</w:t>
+              <w:br/>
+            </w:r>
+            <w:r>
+              <w:rPr>
+                <w:rFonts w:ascii="DejaVu Sans" w:hAnsi="DejaVu Sans"/>
+                <w:b/>
+                <w:i w:val="0"/>
+                <w:color w:val="172033"/>
+                <w:sz w:val="16"/>
+              </w:rPr>
+              <w:t>Intégrale Sécurité Formations</w:t>
+            </w:r>
+          </w:p>
+        </w:tc>
+        <w:tc>
+          <w:tcPr>
+            <w:tcW w:type="dxa" w:w="3311999"/>
+            <w:shd w:fill="FFFFFF"/>
+            <w:tcMar>
+              <w:top w:w="65" w:type="dxa"/>
+              <w:start w:w="100" w:type="dxa"/>
+              <w:bottom w:w="65" w:type="dxa"/>
+              <w:end w:w="100" w:type="dxa"/>
+            </w:tcMar>
+            <w:tcBorders>
+              <w:top w:val="single" w:sz="6" w:space="0" w:color="CBD5E1"/>
+              <w:left w:val="single" w:sz="6" w:space="0" w:color="CBD5E1"/>
+              <w:bottom w:val="single" w:sz="6" w:space="0" w:color="CBD5E1"/>
+              <w:right w:val="single" w:sz="6" w:space="0" w:color="CBD5E1"/>
+            </w:tcBorders>
+          </w:tcPr>
+          <w:p>
+            <w:pPr>
+              <w:spacing w:before="0" w:after="0" w:line="240" w:lineRule="auto"/>
+            </w:pPr>
+            <w:r>
+              <w:rPr>
+                <w:rFonts w:ascii="DejaVu Sans" w:hAnsi="DejaVu Sans"/>
+                <w:b/>
+                <w:i w:val="0"/>
+                <w:color w:val="64748B"/>
+                <w:sz w:val="14"/>
+              </w:rPr>
+              <w:t>SIRET / Code NAF</w:t>
+              <w:br/>
+            </w:r>
+            <w:r>
+              <w:rPr>
+                <w:rFonts w:ascii="DejaVu Sans" w:hAnsi="DejaVu Sans"/>
+                <w:b/>
+                <w:i w:val="0"/>
+                <w:color w:val="172033"/>
+                <w:sz w:val="16"/>
+              </w:rPr>
+              <w:t>840 899 884 00026 / 8559A</w:t>
+            </w:r>
+          </w:p>
+        </w:tc>
+      </w:tr>
+      <w:tr>
+        <w:tc>
+          <w:tcPr>
+            <w:tcW w:type="dxa" w:w="3311999"/>
+            <w:shd w:fill="F8FAFC"/>
+            <w:tcMar>
+              <w:top w:w="65" w:type="dxa"/>
+              <w:start w:w="100" w:type="dxa"/>
+              <w:bottom w:w="65" w:type="dxa"/>
+              <w:end w:w="100" w:type="dxa"/>
+            </w:tcMar>
+            <w:tcBorders>
+              <w:top w:val="single" w:sz="6" w:space="0" w:color="CBD5E1"/>
+              <w:left w:val="single" w:sz="6" w:space="0" w:color="CBD5E1"/>
+              <w:bottom w:val="single" w:sz="6" w:space="0" w:color="CBD5E1"/>
+              <w:right w:val="single" w:sz="6" w:space="0" w:color="CBD5E1"/>
+            </w:tcBorders>
+          </w:tcPr>
+          <w:p>
+            <w:pPr>
+              <w:spacing w:before="0" w:after="0" w:line="240" w:lineRule="auto"/>
+            </w:pPr>
+            <w:r>
+              <w:rPr>
+                <w:rFonts w:ascii="DejaVu Sans" w:hAnsi="DejaVu Sans"/>
+                <w:b/>
+                <w:i w:val="0"/>
+                <w:color w:val="64748B"/>
+                <w:sz w:val="14"/>
+              </w:rPr>
+              <w:t>Déclaration d’activité (NDA)</w:t>
+              <w:br/>
+            </w:r>
+            <w:r>
+              <w:rPr>
+                <w:rFonts w:ascii="DejaVu Sans" w:hAnsi="DejaVu Sans"/>
+                <w:b/>
+                <w:i w:val="0"/>
+                <w:color w:val="172033"/>
+                <w:sz w:val="16"/>
+              </w:rPr>
+              <w:t>n°93830600283</w:t>
+            </w:r>
+          </w:p>
+        </w:tc>
+        <w:tc>
+          <w:tcPr>
+            <w:tcW w:type="dxa" w:w="3311999"/>
+            <w:shd w:fill="F8FAFC"/>
+            <w:tcMar>
+              <w:top w:w="65" w:type="dxa"/>
+              <w:start w:w="100" w:type="dxa"/>
+              <w:bottom w:w="65" w:type="dxa"/>
+              <w:end w:w="100" w:type="dxa"/>
+            </w:tcMar>
+            <w:tcBorders>
+              <w:top w:val="single" w:sz="6" w:space="0" w:color="CBD5E1"/>
+              <w:left w:val="single" w:sz="6" w:space="0" w:color="CBD5E1"/>
+              <w:bottom w:val="single" w:sz="6" w:space="0" w:color="CBD5E1"/>
+              <w:right w:val="single" w:sz="6" w:space="0" w:color="CBD5E1"/>
+            </w:tcBorders>
+          </w:tcPr>
+          <w:p>
+            <w:pPr>
+              <w:spacing w:before="0" w:after="0" w:line="240" w:lineRule="auto"/>
+            </w:pPr>
+            <w:r>
+              <w:rPr>
+                <w:rFonts w:ascii="DejaVu Sans" w:hAnsi="DejaVu Sans"/>
+                <w:b/>
+                <w:i w:val="0"/>
+                <w:color w:val="64748B"/>
+                <w:sz w:val="14"/>
+              </w:rPr>
+              <w:t>Certification Qualiopi</w:t>
+              <w:br/>
+            </w:r>
+            <w:r>
+              <w:rPr>
+                <w:rFonts w:ascii="DejaVu Sans" w:hAnsi="DejaVu Sans"/>
+                <w:b/>
+                <w:i w:val="0"/>
+                <w:color w:val="172033"/>
+                <w:sz w:val="16"/>
+              </w:rPr>
+              <w:t>n°03169 — SGS — 21/10/2024</w:t>
+            </w:r>
+          </w:p>
+        </w:tc>
+      </w:tr>
+      <w:tr>
+        <w:tc>
+          <w:tcPr>
+            <w:tcW w:type="dxa" w:w="3311999"/>
+            <w:shd w:fill="FFFFFF"/>
+            <w:tcMar>
+              <w:top w:w="65" w:type="dxa"/>
+              <w:start w:w="100" w:type="dxa"/>
+              <w:bottom w:w="65" w:type="dxa"/>
+              <w:end w:w="100" w:type="dxa"/>
+            </w:tcMar>
+            <w:tcBorders>
+              <w:top w:val="single" w:sz="6" w:space="0" w:color="CBD5E1"/>
+              <w:left w:val="single" w:sz="6" w:space="0" w:color="CBD5E1"/>
+              <w:bottom w:val="single" w:sz="6" w:space="0" w:color="CBD5E1"/>
+              <w:right w:val="single" w:sz="6" w:space="0" w:color="CBD5E1"/>
+            </w:tcBorders>
+          </w:tcPr>
+          <w:p>
+            <w:pPr>
+              <w:spacing w:before="0" w:after="0" w:line="240" w:lineRule="auto"/>
+            </w:pPr>
+            <w:r>
+              <w:rPr>
+                <w:rFonts w:ascii="DejaVu Sans" w:hAnsi="DejaVu Sans"/>
+                <w:b/>
+                <w:i w:val="0"/>
+                <w:color w:val="64748B"/>
+                <w:sz w:val="14"/>
+              </w:rPr>
+              <w:t>Autorisation d’exercice CNAPS</w:t>
+              <w:br/>
+            </w:r>
+            <w:r>
+              <w:rPr>
+                <w:rFonts w:ascii="DejaVu Sans" w:hAnsi="DejaVu Sans"/>
+                <w:b/>
+                <w:i w:val="0"/>
+                <w:color w:val="172033"/>
+                <w:sz w:val="16"/>
+              </w:rPr>
+              <w:t>n°FOR-083-2027-02-08-20200755135</w:t>
+            </w:r>
+          </w:p>
+        </w:tc>
+        <w:tc>
+          <w:tcPr>
+            <w:tcW w:type="dxa" w:w="3311999"/>
+            <w:shd w:fill="FFFFFF"/>
+            <w:tcMar>
+              <w:top w:w="65" w:type="dxa"/>
+              <w:start w:w="100" w:type="dxa"/>
+              <w:bottom w:w="65" w:type="dxa"/>
+              <w:end w:w="100" w:type="dxa"/>
+            </w:tcMar>
+            <w:tcBorders>
+              <w:top w:val="single" w:sz="6" w:space="0" w:color="CBD5E1"/>
+              <w:left w:val="single" w:sz="6" w:space="0" w:color="CBD5E1"/>
+              <w:bottom w:val="single" w:sz="6" w:space="0" w:color="CBD5E1"/>
+              <w:right w:val="single" w:sz="6" w:space="0" w:color="CBD5E1"/>
+            </w:tcBorders>
+          </w:tcPr>
+          <w:p>
+            <w:pPr>
+              <w:spacing w:before="0" w:after="0" w:line="240" w:lineRule="auto"/>
+            </w:pPr>
+            <w:r>
+              <w:rPr>
+                <w:rFonts w:ascii="DejaVu Sans" w:hAnsi="DejaVu Sans"/>
+                <w:b/>
+                <w:i w:val="0"/>
+                <w:color w:val="64748B"/>
+                <w:sz w:val="14"/>
+              </w:rPr>
+              <w:t>Agrément APS CPNEFP/ADEF</w:t>
+              <w:br/>
+            </w:r>
+            <w:r>
+              <w:rPr>
+                <w:rFonts w:ascii="DejaVu Sans" w:hAnsi="DejaVu Sans"/>
+                <w:b/>
+                <w:i w:val="0"/>
+                <w:color w:val="172033"/>
+                <w:sz w:val="16"/>
+              </w:rPr>
+              <w:t>n°8320032701 — délivré le 23/06/2025</w:t>
             </w:r>
           </w:p>
         </w:tc>
@@ -1270,84 +1494,6 @@
         </w:tc>
       </w:tr>
     </w:tbl>
-    <w:tbl>
-      <w:tblPr>
-        <w:tblW w:type="auto" w:w="0"/>
-        <w:jc w:val="center"/>
-        <w:tblLook w:firstColumn="1" w:firstRow="1" w:lastColumn="0" w:lastRow="0" w:noHBand="0" w:noVBand="1" w:val="04A0"/>
-      </w:tblPr>
-      <w:tblGrid>
-        <w:gridCol w:w="10432"/>
-      </w:tblGrid>
-      <w:tr>
-        <w:tc>
-          <w:tcPr>
-            <w:tcW w:type="dxa" w:w="10432"/>
-            <w:shd w:fill="FFF7E6"/>
-            <w:tcBorders>
-              <w:top w:val="single" w:sz="10" w:space="0" w:color="E78B18"/>
-              <w:left w:val="single" w:sz="10" w:space="0" w:color="E78B18"/>
-              <w:bottom w:val="single" w:sz="10" w:space="0" w:color="E78B18"/>
-              <w:right w:val="single" w:sz="10" w:space="0" w:color="E78B18"/>
-            </w:tcBorders>
-            <w:tcMar>
-              <w:top w:w="65" w:type="dxa"/>
-              <w:start w:w="110" w:type="dxa"/>
-              <w:bottom w:w="65" w:type="dxa"/>
-              <w:end w:w="110" w:type="dxa"/>
-            </w:tcMar>
-          </w:tcPr>
-          <w:p>
-            <w:pPr>
-              <w:spacing w:before="0" w:after="0" w:line="240" w:lineRule="auto"/>
-              <w:jc w:val="center"/>
-            </w:pPr>
-            <w:r>
-              <w:rPr>
-                <w:rFonts w:ascii="DejaVu Sans" w:hAnsi="DejaVu Sans"/>
-                <w:b/>
-                <w:i w:val="0"/>
-                <w:color w:val="E78B18"/>
-                <w:sz w:val="16"/>
-              </w:rPr>
-              <w:t>DÉCISION DE GÉNÉRATION : {{ compliance_status }}</w:t>
-            </w:r>
-          </w:p>
-          <w:p>
-            <w:pPr>
-              <w:spacing w:before="40" w:after="0" w:line="240" w:lineRule="auto"/>
-              <w:jc w:val="center"/>
-            </w:pPr>
-            <w:r>
-              <w:rPr>
-                <w:rFonts w:ascii="DejaVu Sans" w:hAnsi="DejaVu Sans"/>
-                <w:b w:val="0"/>
-                <w:i w:val="0"/>
-                <w:color w:val="172033"/>
-                <w:sz w:val="14"/>
-              </w:rPr>
-              <w:t>{{ compliance_detail }}</w:t>
-            </w:r>
-          </w:p>
-          <w:p>
-            <w:pPr>
-              <w:spacing w:before="40" w:after="0" w:line="240" w:lineRule="auto"/>
-              <w:jc w:val="center"/>
-            </w:pPr>
-            <w:r>
-              <w:rPr>
-                <w:rFonts w:ascii="DejaVu Sans" w:hAnsi="DejaVu Sans"/>
-                <w:b/>
-                <w:i w:val="0"/>
-                <w:color w:val="991B1B"/>
-                <w:sz w:val="14"/>
-              </w:rPr>
-              <w:t>{{ force_authorization }}</w:t>
-            </w:r>
-          </w:p>
-        </w:tc>
-      </w:tr>
-    </w:tbl>
     <w:p>
       <w:pPr>
         <w:spacing w:before="0" w:after="60" w:line="240" w:lineRule="auto"/>
@@ -1792,21 +1938,6 @@
     </w:tbl>
     <w:p>
       <w:pPr>
-        <w:spacing w:before="40" w:after="0" w:line="240" w:lineRule="auto"/>
-      </w:pPr>
-      <w:r>
-        <w:rPr>
-          <w:rFonts w:ascii="DejaVu Sans" w:hAnsi="DejaVu Sans"/>
-          <w:b w:val="0"/>
-          <w:i/>
-          <w:color w:val="64748B"/>
-          <w:sz w:val="14"/>
-        </w:rPr>
-        <w:t>Le relevé Digiforma annexé demeure la pièce source détaillée. Le présent bordereau en synthétise les données sans s'y substituer.</w:t>
-      </w:r>
-    </w:p>
-    <w:p>
-      <w:pPr>
         <w:sectPr>
           <w:footerReference w:type="default" r:id="rId9"/>
           <w:pgSz w:w="11906" w:h="16838"/>
@@ -1914,51 +2045,6 @@
                 <w:sz w:val="18"/>
               </w:rPr>
               <w:t>ATTESTATIONS RÉGLEMENTAIRES ET SIGNATURES</w:t>
-            </w:r>
-          </w:p>
-        </w:tc>
-      </w:tr>
-    </w:tbl>
-    <w:tbl>
-      <w:tblPr>
-        <w:tblW w:type="auto" w:w="0"/>
-        <w:jc w:val="center"/>
-        <w:tblLook w:firstColumn="1" w:firstRow="1" w:lastColumn="0" w:lastRow="0" w:noHBand="0" w:noVBand="1" w:val="04A0"/>
-      </w:tblPr>
-      <w:tblGrid>
-        <w:gridCol w:w="10432"/>
-      </w:tblGrid>
-      <w:tr>
-        <w:tc>
-          <w:tcPr>
-            <w:tcW w:type="dxa" w:w="10432"/>
-            <w:shd w:fill="EFF6FF"/>
-            <w:tcBorders>
-              <w:top w:val="single" w:sz="10" w:space="0" w:color="1D4ED8"/>
-              <w:left w:val="single" w:sz="10" w:space="0" w:color="1D4ED8"/>
-              <w:bottom w:val="single" w:sz="10" w:space="0" w:color="1D4ED8"/>
-              <w:right w:val="single" w:sz="10" w:space="0" w:color="1D4ED8"/>
-            </w:tcBorders>
-            <w:tcMar>
-              <w:top w:w="90" w:type="dxa"/>
-              <w:start w:w="130" w:type="dxa"/>
-              <w:bottom w:w="90" w:type="dxa"/>
-              <w:end w:w="130" w:type="dxa"/>
-            </w:tcMar>
-          </w:tcPr>
-          <w:p>
-            <w:pPr>
-              <w:spacing w:before="0" w:after="0" w:line="240" w:lineRule="auto"/>
-            </w:pPr>
-            <w:r>
-              <w:rPr>
-                <w:rFonts w:ascii="DejaVu Sans" w:hAnsi="DejaVu Sans"/>
-                <w:b/>
-                <w:i w:val="0"/>
-                <w:color w:val="1D4ED8"/>
-                <w:sz w:val="15"/>
-              </w:rPr>
-              <w:t>{{ signature_instruction }}</w:t>
             </w:r>
           </w:p>
         </w:tc>

</xml_diff>

<commit_message>
Simplifie et complète le tableau de suivi FOAD APS (#1966)
</commit_message>
<xml_diff>
--- a/templates_word/tableau_suivi_foad_cnaps.docx
+++ b/templates_word/tableau_suivi_foad_cnaps.docx
@@ -131,56 +131,6 @@
       <w:tblPr>
         <w:tblW w:type="auto" w:w="0"/>
         <w:jc w:val="center"/>
-        <w:tblLook w:firstColumn="1" w:firstRow="1" w:lastColumn="0" w:lastRow="0" w:noHBand="0" w:noVBand="1" w:val="04A0"/>
-      </w:tblPr>
-      <w:tblGrid>
-        <w:gridCol w:w="10432"/>
-      </w:tblGrid>
-      <w:tr>
-        <w:tc>
-          <w:tcPr>
-            <w:tcW w:type="dxa" w:w="10432"/>
-            <w:shd w:fill="FFF7E6"/>
-            <w:tcBorders>
-              <w:top w:val="single" w:sz="10" w:space="0" w:color="F5B942"/>
-              <w:left w:val="single" w:sz="10" w:space="0" w:color="F5B942"/>
-              <w:bottom w:val="single" w:sz="10" w:space="0" w:color="F5B942"/>
-              <w:right w:val="single" w:sz="10" w:space="0" w:color="F5B942"/>
-            </w:tcBorders>
-            <w:tcMar>
-              <w:top w:w="90" w:type="dxa"/>
-              <w:start w:w="130" w:type="dxa"/>
-              <w:bottom w:w="90" w:type="dxa"/>
-              <w:end w:w="130" w:type="dxa"/>
-            </w:tcMar>
-          </w:tcPr>
-          <w:p>
-            <w:pPr>
-              <w:spacing w:before="0" w:after="0" w:line="240" w:lineRule="auto"/>
-            </w:pPr>
-            <w:r>
-              <w:rPr>
-                <w:rFonts w:ascii="DejaVu Sans" w:hAnsi="DejaVu Sans"/>
-                <w:b/>
-                <w:i w:val="0"/>
-                <w:color w:val="172033"/>
-                <w:sz w:val="16"/>
-              </w:rPr>
-              <w:t>DOSSIER INDISSOCIABLE — Les 2 pages du présent bordereau et toutes les pages du relevé individuel Digiforma sont assemblées dans un PDF unique soumis à la signature électronique Yousign.</w:t>
-            </w:r>
-          </w:p>
-        </w:tc>
-      </w:tr>
-    </w:tbl>
-    <w:p>
-      <w:pPr>
-        <w:spacing w:before="0" w:after="60" w:line="240" w:lineRule="auto"/>
-      </w:pPr>
-    </w:p>
-    <w:tbl>
-      <w:tblPr>
-        <w:tblW w:type="auto" w:w="0"/>
-        <w:jc w:val="center"/>
         <w:tblLayout w:type="fixed"/>
         <w:tblLook w:firstColumn="1" w:firstRow="1" w:lastColumn="0" w:lastRow="0" w:noHBand="0" w:noVBand="1" w:val="04A0"/>
       </w:tblPr>
@@ -300,7 +250,7 @@
                 <w:color w:val="64748B"/>
                 <w:sz w:val="14"/>
               </w:rPr>
-              <w:t>Formation / session</w:t>
+              <w:t>Formation</w:t>
               <w:br/>
             </w:r>
             <w:r>
@@ -614,7 +564,7 @@
                 <w:color w:val="64748B"/>
                 <w:sz w:val="14"/>
               </w:rPr>
-              <w:t>Lieu d'établissement</w:t>
+              <w:t>Lieu d’établissement</w:t>
               <w:br/>
             </w:r>
             <w:r>
@@ -625,7 +575,281 @@
                 <w:color w:val="172033"/>
                 <w:sz w:val="16"/>
               </w:rPr>
-              <w:t>Puget-sur-Argens</w:t>
+              <w:t>Intégrale Sécurité Formations</w:t>
+              <w:br/>
+              <w:t>54 chemin du Carreou</w:t>
+              <w:br/>
+              <w:t>83480 PUGET SUR ARGENS</w:t>
+            </w:r>
+          </w:p>
+        </w:tc>
+      </w:tr>
+      <w:tr>
+        <w:tc>
+          <w:tcPr>
+            <w:tcW w:type="dxa" w:w="3311999"/>
+            <w:shd w:fill="FFFFFF"/>
+            <w:tcMar>
+              <w:top w:w="65" w:type="dxa"/>
+              <w:start w:w="100" w:type="dxa"/>
+              <w:bottom w:w="65" w:type="dxa"/>
+              <w:end w:w="100" w:type="dxa"/>
+            </w:tcMar>
+            <w:tcBorders>
+              <w:top w:val="single" w:sz="6" w:space="0" w:color="CBD5E1"/>
+              <w:left w:val="single" w:sz="6" w:space="0" w:color="CBD5E1"/>
+              <w:bottom w:val="single" w:sz="6" w:space="0" w:color="CBD5E1"/>
+              <w:right w:val="single" w:sz="6" w:space="0" w:color="CBD5E1"/>
+            </w:tcBorders>
+          </w:tcPr>
+          <w:p>
+            <w:pPr>
+              <w:spacing w:before="0" w:after="0" w:line="240" w:lineRule="auto"/>
+            </w:pPr>
+            <w:r>
+              <w:rPr>
+                <w:rFonts w:ascii="DejaVu Sans" w:hAnsi="DejaVu Sans"/>
+                <w:b/>
+                <w:i w:val="0"/>
+                <w:color w:val="64748B"/>
+                <w:sz w:val="14"/>
+              </w:rPr>
+              <w:t>Organisme de formation</w:t>
+              <w:br/>
+            </w:r>
+            <w:r>
+              <w:rPr>
+                <w:rFonts w:ascii="DejaVu Sans" w:hAnsi="DejaVu Sans"/>
+                <w:b/>
+                <w:i w:val="0"/>
+                <w:color w:val="172033"/>
+                <w:sz w:val="16"/>
+              </w:rPr>
+              <w:t>Intégrale Sécurité Formations</w:t>
+            </w:r>
+          </w:p>
+        </w:tc>
+        <w:tc>
+          <w:tcPr>
+            <w:tcW w:type="dxa" w:w="3311999"/>
+            <w:shd w:fill="FFFFFF"/>
+            <w:tcMar>
+              <w:top w:w="65" w:type="dxa"/>
+              <w:start w:w="100" w:type="dxa"/>
+              <w:bottom w:w="65" w:type="dxa"/>
+              <w:end w:w="100" w:type="dxa"/>
+            </w:tcMar>
+            <w:tcBorders>
+              <w:top w:val="single" w:sz="6" w:space="0" w:color="CBD5E1"/>
+              <w:left w:val="single" w:sz="6" w:space="0" w:color="CBD5E1"/>
+              <w:bottom w:val="single" w:sz="6" w:space="0" w:color="CBD5E1"/>
+              <w:right w:val="single" w:sz="6" w:space="0" w:color="CBD5E1"/>
+            </w:tcBorders>
+          </w:tcPr>
+          <w:p>
+            <w:pPr>
+              <w:spacing w:before="0" w:after="0" w:line="240" w:lineRule="auto"/>
+            </w:pPr>
+            <w:r>
+              <w:rPr>
+                <w:rFonts w:ascii="DejaVu Sans" w:hAnsi="DejaVu Sans"/>
+                <w:b/>
+                <w:i w:val="0"/>
+                <w:color w:val="64748B"/>
+                <w:sz w:val="14"/>
+              </w:rPr>
+              <w:t>SIRET / Code NAF</w:t>
+              <w:br/>
+            </w:r>
+            <w:r>
+              <w:rPr>
+                <w:rFonts w:ascii="DejaVu Sans" w:hAnsi="DejaVu Sans"/>
+                <w:b/>
+                <w:i w:val="0"/>
+                <w:color w:val="172033"/>
+                <w:sz w:val="16"/>
+              </w:rPr>
+              <w:t>840 899 884 00026 / 8559A</w:t>
+            </w:r>
+          </w:p>
+        </w:tc>
+      </w:tr>
+      <w:tr>
+        <w:tc>
+          <w:tcPr>
+            <w:tcW w:type="dxa" w:w="3311999"/>
+            <w:shd w:fill="F8FAFC"/>
+            <w:tcMar>
+              <w:top w:w="65" w:type="dxa"/>
+              <w:start w:w="100" w:type="dxa"/>
+              <w:bottom w:w="65" w:type="dxa"/>
+              <w:end w:w="100" w:type="dxa"/>
+            </w:tcMar>
+            <w:tcBorders>
+              <w:top w:val="single" w:sz="6" w:space="0" w:color="CBD5E1"/>
+              <w:left w:val="single" w:sz="6" w:space="0" w:color="CBD5E1"/>
+              <w:bottom w:val="single" w:sz="6" w:space="0" w:color="CBD5E1"/>
+              <w:right w:val="single" w:sz="6" w:space="0" w:color="CBD5E1"/>
+            </w:tcBorders>
+          </w:tcPr>
+          <w:p>
+            <w:pPr>
+              <w:spacing w:before="0" w:after="0" w:line="240" w:lineRule="auto"/>
+            </w:pPr>
+            <w:r>
+              <w:rPr>
+                <w:rFonts w:ascii="DejaVu Sans" w:hAnsi="DejaVu Sans"/>
+                <w:b/>
+                <w:i w:val="0"/>
+                <w:color w:val="64748B"/>
+                <w:sz w:val="14"/>
+              </w:rPr>
+              <w:t>Déclaration d’activité (NDA)</w:t>
+              <w:br/>
+            </w:r>
+            <w:r>
+              <w:rPr>
+                <w:rFonts w:ascii="DejaVu Sans" w:hAnsi="DejaVu Sans"/>
+                <w:b/>
+                <w:i w:val="0"/>
+                <w:color w:val="172033"/>
+                <w:sz w:val="16"/>
+              </w:rPr>
+              <w:t>n°93830600283</w:t>
+            </w:r>
+          </w:p>
+        </w:tc>
+        <w:tc>
+          <w:tcPr>
+            <w:tcW w:type="dxa" w:w="3311999"/>
+            <w:shd w:fill="F8FAFC"/>
+            <w:tcMar>
+              <w:top w:w="65" w:type="dxa"/>
+              <w:start w:w="100" w:type="dxa"/>
+              <w:bottom w:w="65" w:type="dxa"/>
+              <w:end w:w="100" w:type="dxa"/>
+            </w:tcMar>
+            <w:tcBorders>
+              <w:top w:val="single" w:sz="6" w:space="0" w:color="CBD5E1"/>
+              <w:left w:val="single" w:sz="6" w:space="0" w:color="CBD5E1"/>
+              <w:bottom w:val="single" w:sz="6" w:space="0" w:color="CBD5E1"/>
+              <w:right w:val="single" w:sz="6" w:space="0" w:color="CBD5E1"/>
+            </w:tcBorders>
+          </w:tcPr>
+          <w:p>
+            <w:pPr>
+              <w:spacing w:before="0" w:after="0" w:line="240" w:lineRule="auto"/>
+            </w:pPr>
+            <w:r>
+              <w:rPr>
+                <w:rFonts w:ascii="DejaVu Sans" w:hAnsi="DejaVu Sans"/>
+                <w:b/>
+                <w:i w:val="0"/>
+                <w:color w:val="64748B"/>
+                <w:sz w:val="14"/>
+              </w:rPr>
+              <w:t>Certification Qualiopi</w:t>
+              <w:br/>
+            </w:r>
+            <w:r>
+              <w:rPr>
+                <w:rFonts w:ascii="DejaVu Sans" w:hAnsi="DejaVu Sans"/>
+                <w:b/>
+                <w:i w:val="0"/>
+                <w:color w:val="172033"/>
+                <w:sz w:val="16"/>
+              </w:rPr>
+              <w:t>n°03169 — SGS — 21/10/2024</w:t>
+            </w:r>
+          </w:p>
+        </w:tc>
+      </w:tr>
+      <w:tr>
+        <w:tc>
+          <w:tcPr>
+            <w:tcW w:type="dxa" w:w="3311999"/>
+            <w:shd w:fill="FFFFFF"/>
+            <w:tcMar>
+              <w:top w:w="65" w:type="dxa"/>
+              <w:start w:w="100" w:type="dxa"/>
+              <w:bottom w:w="65" w:type="dxa"/>
+              <w:end w:w="100" w:type="dxa"/>
+            </w:tcMar>
+            <w:tcBorders>
+              <w:top w:val="single" w:sz="6" w:space="0" w:color="CBD5E1"/>
+              <w:left w:val="single" w:sz="6" w:space="0" w:color="CBD5E1"/>
+              <w:bottom w:val="single" w:sz="6" w:space="0" w:color="CBD5E1"/>
+              <w:right w:val="single" w:sz="6" w:space="0" w:color="CBD5E1"/>
+            </w:tcBorders>
+          </w:tcPr>
+          <w:p>
+            <w:pPr>
+              <w:spacing w:before="0" w:after="0" w:line="240" w:lineRule="auto"/>
+            </w:pPr>
+            <w:r>
+              <w:rPr>
+                <w:rFonts w:ascii="DejaVu Sans" w:hAnsi="DejaVu Sans"/>
+                <w:b/>
+                <w:i w:val="0"/>
+                <w:color w:val="64748B"/>
+                <w:sz w:val="14"/>
+              </w:rPr>
+              <w:t>Autorisation d’exercice CNAPS</w:t>
+              <w:br/>
+            </w:r>
+            <w:r>
+              <w:rPr>
+                <w:rFonts w:ascii="DejaVu Sans" w:hAnsi="DejaVu Sans"/>
+                <w:b/>
+                <w:i w:val="0"/>
+                <w:color w:val="172033"/>
+                <w:sz w:val="16"/>
+              </w:rPr>
+              <w:t>n°FOR-083-2027-02-08-20200755135</w:t>
+            </w:r>
+          </w:p>
+        </w:tc>
+        <w:tc>
+          <w:tcPr>
+            <w:tcW w:type="dxa" w:w="3311999"/>
+            <w:shd w:fill="FFFFFF"/>
+            <w:tcMar>
+              <w:top w:w="65" w:type="dxa"/>
+              <w:start w:w="100" w:type="dxa"/>
+              <w:bottom w:w="65" w:type="dxa"/>
+              <w:end w:w="100" w:type="dxa"/>
+            </w:tcMar>
+            <w:tcBorders>
+              <w:top w:val="single" w:sz="6" w:space="0" w:color="CBD5E1"/>
+              <w:left w:val="single" w:sz="6" w:space="0" w:color="CBD5E1"/>
+              <w:bottom w:val="single" w:sz="6" w:space="0" w:color="CBD5E1"/>
+              <w:right w:val="single" w:sz="6" w:space="0" w:color="CBD5E1"/>
+            </w:tcBorders>
+          </w:tcPr>
+          <w:p>
+            <w:pPr>
+              <w:spacing w:before="0" w:after="0" w:line="240" w:lineRule="auto"/>
+            </w:pPr>
+            <w:r>
+              <w:rPr>
+                <w:rFonts w:ascii="DejaVu Sans" w:hAnsi="DejaVu Sans"/>
+                <w:b/>
+                <w:i w:val="0"/>
+                <w:color w:val="64748B"/>
+                <w:sz w:val="14"/>
+              </w:rPr>
+              <w:t>Agrément APS CPNEFP/ADEF</w:t>
+              <w:br/>
+            </w:r>
+            <w:r>
+              <w:rPr>
+                <w:rFonts w:ascii="DejaVu Sans" w:hAnsi="DejaVu Sans"/>
+                <w:b/>
+                <w:i w:val="0"/>
+                <w:color w:val="172033"/>
+                <w:sz w:val="16"/>
+              </w:rPr>
+              <w:t>n°8320032701 — délivré le 23/06/2025</w:t>
             </w:r>
           </w:p>
         </w:tc>
@@ -1270,84 +1494,6 @@
         </w:tc>
       </w:tr>
     </w:tbl>
-    <w:tbl>
-      <w:tblPr>
-        <w:tblW w:type="auto" w:w="0"/>
-        <w:jc w:val="center"/>
-        <w:tblLook w:firstColumn="1" w:firstRow="1" w:lastColumn="0" w:lastRow="0" w:noHBand="0" w:noVBand="1" w:val="04A0"/>
-      </w:tblPr>
-      <w:tblGrid>
-        <w:gridCol w:w="10432"/>
-      </w:tblGrid>
-      <w:tr>
-        <w:tc>
-          <w:tcPr>
-            <w:tcW w:type="dxa" w:w="10432"/>
-            <w:shd w:fill="FFF7E6"/>
-            <w:tcBorders>
-              <w:top w:val="single" w:sz="10" w:space="0" w:color="E78B18"/>
-              <w:left w:val="single" w:sz="10" w:space="0" w:color="E78B18"/>
-              <w:bottom w:val="single" w:sz="10" w:space="0" w:color="E78B18"/>
-              <w:right w:val="single" w:sz="10" w:space="0" w:color="E78B18"/>
-            </w:tcBorders>
-            <w:tcMar>
-              <w:top w:w="65" w:type="dxa"/>
-              <w:start w:w="110" w:type="dxa"/>
-              <w:bottom w:w="65" w:type="dxa"/>
-              <w:end w:w="110" w:type="dxa"/>
-            </w:tcMar>
-          </w:tcPr>
-          <w:p>
-            <w:pPr>
-              <w:spacing w:before="0" w:after="0" w:line="240" w:lineRule="auto"/>
-              <w:jc w:val="center"/>
-            </w:pPr>
-            <w:r>
-              <w:rPr>
-                <w:rFonts w:ascii="DejaVu Sans" w:hAnsi="DejaVu Sans"/>
-                <w:b/>
-                <w:i w:val="0"/>
-                <w:color w:val="E78B18"/>
-                <w:sz w:val="16"/>
-              </w:rPr>
-              <w:t>DÉCISION DE GÉNÉRATION : {{ compliance_status }}</w:t>
-            </w:r>
-          </w:p>
-          <w:p>
-            <w:pPr>
-              <w:spacing w:before="40" w:after="0" w:line="240" w:lineRule="auto"/>
-              <w:jc w:val="center"/>
-            </w:pPr>
-            <w:r>
-              <w:rPr>
-                <w:rFonts w:ascii="DejaVu Sans" w:hAnsi="DejaVu Sans"/>
-                <w:b w:val="0"/>
-                <w:i w:val="0"/>
-                <w:color w:val="172033"/>
-                <w:sz w:val="14"/>
-              </w:rPr>
-              <w:t>{{ compliance_detail }}</w:t>
-            </w:r>
-          </w:p>
-          <w:p>
-            <w:pPr>
-              <w:spacing w:before="40" w:after="0" w:line="240" w:lineRule="auto"/>
-              <w:jc w:val="center"/>
-            </w:pPr>
-            <w:r>
-              <w:rPr>
-                <w:rFonts w:ascii="DejaVu Sans" w:hAnsi="DejaVu Sans"/>
-                <w:b/>
-                <w:i w:val="0"/>
-                <w:color w:val="991B1B"/>
-                <w:sz w:val="14"/>
-              </w:rPr>
-              <w:t>{{ force_authorization }}</w:t>
-            </w:r>
-          </w:p>
-        </w:tc>
-      </w:tr>
-    </w:tbl>
     <w:p>
       <w:pPr>
         <w:spacing w:before="0" w:after="60" w:line="240" w:lineRule="auto"/>
@@ -1792,21 +1938,6 @@
     </w:tbl>
     <w:p>
       <w:pPr>
-        <w:spacing w:before="40" w:after="0" w:line="240" w:lineRule="auto"/>
-      </w:pPr>
-      <w:r>
-        <w:rPr>
-          <w:rFonts w:ascii="DejaVu Sans" w:hAnsi="DejaVu Sans"/>
-          <w:b w:val="0"/>
-          <w:i/>
-          <w:color w:val="64748B"/>
-          <w:sz w:val="14"/>
-        </w:rPr>
-        <w:t>Le relevé Digiforma annexé demeure la pièce source détaillée. Le présent bordereau en synthétise les données sans s'y substituer.</w:t>
-      </w:r>
-    </w:p>
-    <w:p>
-      <w:pPr>
         <w:sectPr>
           <w:footerReference w:type="default" r:id="rId9"/>
           <w:pgSz w:w="11906" w:h="16838"/>
@@ -1914,51 +2045,6 @@
                 <w:sz w:val="18"/>
               </w:rPr>
               <w:t>ATTESTATIONS RÉGLEMENTAIRES ET SIGNATURES</w:t>
-            </w:r>
-          </w:p>
-        </w:tc>
-      </w:tr>
-    </w:tbl>
-    <w:tbl>
-      <w:tblPr>
-        <w:tblW w:type="auto" w:w="0"/>
-        <w:jc w:val="center"/>
-        <w:tblLook w:firstColumn="1" w:firstRow="1" w:lastColumn="0" w:lastRow="0" w:noHBand="0" w:noVBand="1" w:val="04A0"/>
-      </w:tblPr>
-      <w:tblGrid>
-        <w:gridCol w:w="10432"/>
-      </w:tblGrid>
-      <w:tr>
-        <w:tc>
-          <w:tcPr>
-            <w:tcW w:type="dxa" w:w="10432"/>
-            <w:shd w:fill="EFF6FF"/>
-            <w:tcBorders>
-              <w:top w:val="single" w:sz="10" w:space="0" w:color="1D4ED8"/>
-              <w:left w:val="single" w:sz="10" w:space="0" w:color="1D4ED8"/>
-              <w:bottom w:val="single" w:sz="10" w:space="0" w:color="1D4ED8"/>
-              <w:right w:val="single" w:sz="10" w:space="0" w:color="1D4ED8"/>
-            </w:tcBorders>
-            <w:tcMar>
-              <w:top w:w="90" w:type="dxa"/>
-              <w:start w:w="130" w:type="dxa"/>
-              <w:bottom w:w="90" w:type="dxa"/>
-              <w:end w:w="130" w:type="dxa"/>
-            </w:tcMar>
-          </w:tcPr>
-          <w:p>
-            <w:pPr>
-              <w:spacing w:before="0" w:after="0" w:line="240" w:lineRule="auto"/>
-            </w:pPr>
-            <w:r>
-              <w:rPr>
-                <w:rFonts w:ascii="DejaVu Sans" w:hAnsi="DejaVu Sans"/>
-                <w:b/>
-                <w:i w:val="0"/>
-                <w:color w:val="1D4ED8"/>
-                <w:sz w:val="15"/>
-              </w:rPr>
-              <w:t>{{ signature_instruction }}</w:t>
             </w:r>
           </w:p>
         </w:tc>

</xml_diff>